<commit_message>
Reframe Euclid DR1 Magellanic outskirts project
</commit_message>
<xml_diff>
--- a/03_Euclid_DR1_Magellanic_Outskirts.docx
+++ b/03_Euclid_DR1_Magellanic_Outskirts.docx
@@ -13,7 +13,7 @@
         <w:rPr>
           <w:rFonts w:ascii="Arial" w:hAnsi="Arial" w:cs="Arial"/>
         </w:rPr>
-        <w:t>Project Title: At the Edge of the Clouds: Mapping the Faint Magellanic Periphery with Euclid DR1</w:t>
+        <w:t>Project Title: Beyond the Clouds: Mapping Smooth Halos and Stellar Substructure around the LMC and SMC with Euclid DR1</w:t>
       </w:r>
     </w:p>
     <w:p>
@@ -99,25 +99,25 @@
           <w:sz w:val="22"/>
           <w:szCs w:val="22"/>
         </w:rPr>
-        <w:t>The outskirts of the Large and Small Magellanic Clouds contain arms, warped and truncated disc material, bridges, and diffuse tidal debris. These low-density structures record repeated LMC–SMC encounters and the response of both galaxies to the Milky Way. Their morphology, distances, and stellar populations can distinguish displaced disc material from an extended halo or debris stripped from a companion.</w:t>
-      </w:r>
-    </w:p>
-    <w:p>
-      <w:pPr>
-        <w:spacing w:before="40" w:after="0" w:line="360" w:lineRule="auto"/>
-        <w:rPr>
-          <w:rFonts w:ascii="Arial" w:hAnsi="Arial" w:cs="Arial"/>
-          <w:sz w:val="22"/>
-          <w:szCs w:val="22"/>
-        </w:rPr>
-      </w:pPr>
-      <w:r>
-        <w:rPr>
-          <w:rFonts w:ascii="Arial" w:hAnsi="Arial" w:cs="Arial"/>
-          <w:sz w:val="22"/>
-          <w:szCs w:val="22"/>
-        </w:rPr>
-        <w:t>This project will use the Euclid DR1 coverage of the Magellanic periphery to construct completeness-corrected maps of several stellar populations, fit a smooth outer component, and measure significant residual structure. Gaia, DELVE-MC, SMASH, and VMC will provide the kinematic and photometric baselines needed to control foreground contamination and interpret population differences. The core project will focus on one well-covered outer sector or named feature; mapping the full periphery and comparing directly with interaction simulations are stretch goals.</w:t>
+        <w:t>The Large and Small Magellanic Clouds do not end at their bright optical bodies. Their faint outskirts contain old stars spread across many degrees, recording past encounters between the Clouds and their response to the Milky Way. Wide-field surveys have revealed outer arms, distorted discs, bridges, and diffuse debris, yet the lowest-density populations remain difficult to separate from foreground stars and background galaxies. Euclid DR1 offers a new view of this regime through deep, sharp imaging over a wide area around both Clouds.</w:t>
+      </w:r>
+    </w:p>
+    <w:p>
+      <w:pPr>
+        <w:spacing w:before="40" w:after="0" w:line="360" w:lineRule="auto"/>
+        <w:rPr>
+          <w:rFonts w:ascii="Arial" w:hAnsi="Arial" w:cs="Arial"/>
+          <w:sz w:val="22"/>
+          <w:szCs w:val="22"/>
+        </w:rPr>
+      </w:pPr>
+      <w:r>
+        <w:rPr>
+          <w:rFonts w:ascii="Arial" w:hAnsi="Arial" w:cs="Arial"/>
+          <w:sz w:val="22"/>
+          <w:szCs w:val="22"/>
+        </w:rPr>
+        <w:t>This project has two equal aims. First, the student will characterise the smooth old stellar component around both the LMC and the SMC: how far it can be traced, how its surface density declines, and how its shape changes with radius and direction. Second, the student will search around both Clouds for departures from that smooth distribution, including arms, streams, diffuse overdensities, distortions, and other previously unseen substructure. Old main-sequence turn-off stars will be the primary tracers; Euclid will detect them in large numbers at faint magnitudes. Straightforward colour-magnitude selections, stellar-density maps, smooth models, and residual maps will form the core analysis. The project is exploratory and discovery-driven: the data will determine what is present and which structures merit closer study.</w:t>
       </w:r>
     </w:p>
     <w:p>
@@ -149,43 +149,43 @@
           <w:sz w:val="22"/>
           <w:szCs w:val="22"/>
         </w:rPr>
-        <w:t>The Magellanic Clouds are the Milky Way's most massive satellites and are probably on their first close approach to our Galaxy. They are also an interacting pair. Their recent orbit and repeated mutual encounters have produced a gaseous Stream and Bridge, but the stellar response is more complex. Deep optical surveys and Gaia have revealed a long northern arm around the LMC, asymmetries and breaks in its outer disc, and multiple structures around the SMC and between the Clouds.</w:t>
-      </w:r>
-    </w:p>
-    <w:p>
-      <w:pPr>
-        <w:spacing w:before="40" w:after="0" w:line="360" w:lineRule="auto"/>
-        <w:rPr>
-          <w:rFonts w:ascii="Arial" w:hAnsi="Arial" w:cs="Arial"/>
-          <w:sz w:val="22"/>
-          <w:szCs w:val="22"/>
-        </w:rPr>
-      </w:pPr>
-      <w:r>
-        <w:rPr>
-          <w:rFonts w:ascii="Arial" w:hAnsi="Arial" w:cs="Arial"/>
-          <w:sz w:val="22"/>
-          <w:szCs w:val="22"/>
-        </w:rPr>
-        <w:t>Different stellar populations offer different clocks. Young stars trace recent star formation and gas, intermediate-age red-clump stars can reveal line-of-sight distance changes, and old main-sequence-turnoff or red-giant stars probe the longest-lived outer components. DELVE-MC now provides a deep, contiguous optical baseline over roughly 2,200 square degrees, while recent red-clump work maps the Clouds in three dimensions. The inference remains difficult because sparse structure can be confused with Milky Way foregrounds, extinction variations and changing survey depth.</w:t>
-      </w:r>
-    </w:p>
-    <w:p>
-      <w:pPr>
-        <w:spacing w:before="40" w:after="0" w:line="360" w:lineRule="auto"/>
-        <w:rPr>
-          <w:rFonts w:ascii="Arial" w:hAnsi="Arial" w:cs="Arial"/>
-          <w:sz w:val="22"/>
-          <w:szCs w:val="22"/>
-        </w:rPr>
-      </w:pPr>
-      <w:r>
-        <w:rPr>
-          <w:rFonts w:ascii="Arial" w:hAnsi="Arial" w:cs="Arial"/>
-          <w:sz w:val="22"/>
-          <w:szCs w:val="22"/>
-        </w:rPr>
-        <w:t>Navarrete et al. (2019) showed why morphology alone is insufficient: kinematics confirmed only two of four photometric stream candidates, although Magellanic tracers extended to about 33 degrees from the LMC. Navarrete et al. (2023) further found that much of the LMC periphery follows a perturbed, non-equilibrium outer disc, with repeated SMC passages favoured over a relaxed halo interpretation. Euclid can extend resolved-star measurements in the low-crowding outskirts; Gaia supplies bright-star kinematics, and DELVE, SMASH, and VMC provide the external baselines needed to distinguish disturbed disc material from tidal debris.</w:t>
+        <w:t>The Magellanic Clouds provide a nearby view of galaxy interaction in progress. Their gaseous Stream and Bridge show that the system has been strongly disturbed, but the stellar response is more complicated. Stars of different ages need not follow the gas, and material displaced from a disc can resemble a tidal stream or spheroidal halo in projection. The oldest widespread populations retain a long record of these encounters and are therefore the natural tracers of the large-scale Magellanic periphery.</w:t>
+      </w:r>
+    </w:p>
+    <w:p>
+      <w:pPr>
+        <w:spacing w:before="40" w:after="0" w:line="360" w:lineRule="auto"/>
+        <w:rPr>
+          <w:rFonts w:ascii="Arial" w:hAnsi="Arial" w:cs="Arial"/>
+          <w:sz w:val="22"/>
+          <w:szCs w:val="22"/>
+        </w:rPr>
+      </w:pPr>
+      <w:r>
+        <w:rPr>
+          <w:rFonts w:ascii="Arial" w:hAnsi="Arial" w:cs="Arial"/>
+          <w:sz w:val="22"/>
+          <w:szCs w:val="22"/>
+        </w:rPr>
+        <w:t>Previous work supplies both the scientific foundation and a validation set. Belokurov &amp; Koposov (2016) found a lumpy, extended distribution and stream candidates around the Clouds. Mackey and collaborators used deep DECam imaging first to reveal a large northern LMC structure and later to construct panoramic maps from old turn-off stars. These maps show truncation, tidal distortions, and diffuse substructure around both galaxies (Mackey et al. 2016, 2018). Belokurov et al. (2017) mapped stellar bridges and tails across the interacting system with Gaia DR1. Around the SMC, turn-off studies have traced a smooth outer population and strong departures from it (Massana et al. 2020).</w:t>
+      </w:r>
+    </w:p>
+    <w:p>
+      <w:pPr>
+        <w:spacing w:before="40" w:after="0" w:line="360" w:lineRule="auto"/>
+        <w:rPr>
+          <w:rFonts w:ascii="Arial" w:hAnsi="Arial" w:cs="Arial"/>
+          <w:sz w:val="22"/>
+          <w:szCs w:val="22"/>
+        </w:rPr>
+      </w:pPr>
+      <w:r>
+        <w:rPr>
+          <w:rFonts w:ascii="Arial" w:hAnsi="Arial" w:cs="Arial"/>
+          <w:sz w:val="22"/>
+          <w:szCs w:val="22"/>
+        </w:rPr>
+        <w:t>These maps also show why interpretation must follow detection. Navarrete et al. (2019) confirmed only two of four photometric stream candidates with spectroscopy, while their later work found that most targeted stars in selected peripheral structures have kinematics consistent with a disturbed outer LMC disc (Navarrete et al. 2023). DELVE-MC provides a deep, contiguous comparison survey and is itself designed to exploit old main-sequence turn-off stars. Euclid DR1 will extend this mapping to fainter turn-off stars. In this project, 'smooth halo' will initially mean the slowly varying old stellar component, not a claim that it is a classical pressure-supported halo. It may include an extended or heated disc, a stellar halo, and tidally disturbed material.</w:t>
       </w:r>
     </w:p>
     <w:p>
@@ -217,7 +217,7 @@
           <w:sz w:val="22"/>
           <w:szCs w:val="22"/>
         </w:rPr>
-        <w:t>The released footprint will determine the target. The student will choose one outer sector with useful radial leverage and a suitable control field, then carry the same selection model from catalogue validation to physical interpretation.</w:t>
+        <w:t>At the start of the academic year, the student will test a simple mapping pipeline on known structures and public Magellanic data. The same pipeline will then be applied to Euclid DR1 around both the LMC and the SMC:</w:t>
       </w:r>
     </w:p>
     <w:p>
@@ -243,15 +243,15 @@
           <w:b/>
           <w:bCs/>
         </w:rPr>
-        <w:t xml:space="preserve">Choose the target region. </w:t>
-      </w:r>
-      <w:r>
-        <w:rPr>
-          <w:rFonts w:ascii="Arial" w:hAnsi="Arial" w:cs="Arial"/>
-          <w:sz w:val="22"/>
-          <w:szCs w:val="22"/>
-        </w:rPr>
-        <w:t>Transform the DR1 coverage and masks into LMC- and SMC-centric coordinates and measure usable radial and azimuthal coverage. Select one primary target: for example, an LMC outer-arm sector, an SMC eastern or southern feature, or an inter-Cloud field. At the same time, define a public-data version based on DELVE-MC, SMASH, VMC, and Gaia so that analysis can begin before all Euclid products arrive.</w:t>
+        <w:t xml:space="preserve">Build the Euclid stellar sample. </w:t>
+      </w:r>
+      <w:r>
+        <w:rPr>
+          <w:rFonts w:ascii="Arial" w:hAnsi="Arial" w:cs="Arial"/>
+          <w:sz w:val="22"/>
+          <w:szCs w:val="22"/>
+        </w:rPr>
+        <w:t>Select reliable point sources and map the DR1 footprint, masks, depth, and completeness. Extinction, image artefacts, foreground stars, and unresolved galaxies can create false structure, so these effects will be characterised before the Magellanic maps are interpreted.</w:t>
       </w:r>
     </w:p>
     <w:p>
@@ -277,15 +277,15 @@
           <w:b/>
           <w:bCs/>
         </w:rPr>
-        <w:t xml:space="preserve">Validate the resolved-star sample. </w:t>
-      </w:r>
-      <w:r>
-        <w:rPr>
-          <w:rFonts w:ascii="Arial" w:hAnsi="Arial" w:cs="Arial"/>
-          <w:sz w:val="22"/>
-          <w:szCs w:val="22"/>
-        </w:rPr>
-        <w:t>Calibrate point-source selection against Gaia members and deep external fields. Map completeness, photometric uncertainty, unresolved-galaxy contamination, extinction, and image masks across the target and control regions. The student will establish the faintest magnitude at which the population maps remain stable under changes in selection thresholds, masks, and extinction corrections.</w:t>
+        <w:t xml:space="preserve">Select the old Magellanic populations. </w:t>
+      </w:r>
+      <w:r>
+        <w:rPr>
+          <w:rFonts w:ascii="Arial" w:hAnsi="Arial" w:cs="Arial"/>
+          <w:sz w:val="22"/>
+          <w:szCs w:val="22"/>
+        </w:rPr>
+        <w:t>Construct simple colour-magnitude selections around old main-sequence turn-off isochrones at the distances of the LMC and SMC. The faint Euclid sample will drive the analysis; brighter subgiants, red giants, and Gaia astrometry will provide supporting checks.</w:t>
       </w:r>
     </w:p>
     <w:p>
@@ -311,15 +311,15 @@
           <w:b/>
           <w:bCs/>
         </w:rPr>
-        <w:t xml:space="preserve">Separate stellar populations. </w:t>
-      </w:r>
-      <w:r>
-        <w:rPr>
-          <w:rFonts w:ascii="Arial" w:hAnsi="Arial" w:cs="Arial"/>
-          <w:sz w:val="22"/>
-          <w:szCs w:val="22"/>
-        </w:rPr>
-        <w:t>Construct probabilistic or matched-filter colour–magnitude selections for old main-sequence-turnoff and subgiant stars, red-giant and red-clump stars, and young main-sequence stars where they are present. DELVE and SMASH will test the optical selection over a much wider area, and VMC will help separate population differences from extinction in the near-infrared. Gaia proper motions will clean and validate the bright subset rather than being required for every faint Euclid source.</w:t>
+        <w:t xml:space="preserve">Map both Clouds. </w:t>
+      </w:r>
+      <w:r>
+        <w:rPr>
+          <w:rFonts w:ascii="Arial" w:hAnsi="Arial" w:cs="Arial"/>
+          <w:sz w:val="22"/>
+          <w:szCs w:val="22"/>
+        </w:rPr>
+        <w:t>Build stellar-density maps in LMC- and SMC-centred coordinates, using control regions to estimate contamination. Recovering published structures around both Clouds will validate the selections before the maps are searched for new signals.</w:t>
       </w:r>
     </w:p>
     <w:p>
@@ -345,15 +345,15 @@
           <w:b/>
           <w:bCs/>
         </w:rPr>
-        <w:t xml:space="preserve">Fit the smooth outskirts. </w:t>
-      </w:r>
-      <w:r>
-        <w:rPr>
-          <w:rFonts w:ascii="Arial" w:hAnsi="Arial" w:cs="Arial"/>
-          <w:sz w:val="22"/>
-          <w:szCs w:val="22"/>
-        </w:rPr>
-        <w:t>Produce adaptive-resolution star-count maps for each population and fit a smooth inclined or broken exponential outer disc. If the data justify it, add a spheroidal component. The likelihood will include the spatially varying selection function and an empirical Milky Way foreground, allowing radial breaks, ellipticity, centroid shifts and azimuthal asymmetry to be measured without mistaking coverage changes for astrophysics.</w:t>
+        <w:t xml:space="preserve">Characterise the smooth components. </w:t>
+      </w:r>
+      <w:r>
+        <w:rPr>
+          <w:rFonts w:ascii="Arial" w:hAnsi="Arial" w:cs="Arial"/>
+          <w:sz w:val="22"/>
+          <w:szCs w:val="22"/>
+        </w:rPr>
+        <w:t>Fit a simple, flexible two-dimensional model to the slowly varying old population around each Cloud. Measure its radial surface-density profile, flattening, orientation, and detectable extent. The model will describe the observed distribution without assuming a disc or classical halo in advance.</w:t>
       </w:r>
     </w:p>
     <w:p>
@@ -379,15 +379,15 @@
           <w:b/>
           <w:bCs/>
         </w:rPr>
-        <w:t xml:space="preserve">Measure residual substructure. </w:t>
-      </w:r>
-      <w:r>
-        <w:rPr>
-          <w:rFonts w:ascii="Arial" w:hAnsi="Arial" w:cs="Arial"/>
-          <w:sz w:val="22"/>
-          <w:szCs w:val="22"/>
-        </w:rPr>
-        <w:t>Quantify the significance of overdense and underdense residuals using mocks or resampled control fields. Select one robust feature and measure its extent, width, contrast, orientation, radial location and population mixture. Alternative masks, extinction maps and foreground models will provide systematic-error bounds.</w:t>
+        <w:t xml:space="preserve">Search for substructure. </w:t>
+      </w:r>
+      <w:r>
+        <w:rPr>
+          <w:rFonts w:ascii="Arial" w:hAnsi="Arial" w:cs="Arial"/>
+          <w:sz w:val="22"/>
+          <w:szCs w:val="22"/>
+        </w:rPr>
+        <w:t>Remove the smooth components and inspect the residual maps for coherent overdensities, extensions, breaks, and asymmetries around both Clouds. Rank credible features by their significance and stability against changes in map scale and smooth model.</w:t>
       </w:r>
     </w:p>
     <w:p>
@@ -413,33 +413,33 @@
           <w:b/>
           <w:bCs/>
         </w:rPr>
-        <w:t xml:space="preserve">Interpret one feature. </w:t>
-      </w:r>
-      <w:r>
-        <w:rPr>
-          <w:rFonts w:ascii="Arial" w:hAnsi="Arial" w:cs="Arial"/>
-          <w:sz w:val="22"/>
-          <w:szCs w:val="22"/>
-        </w:rPr>
-        <w:t>Compare its geometry and population dependence with DELVE/SMASH maps, the DELVE-based red-clump three-dimensional baseline, and available Gaia, VMC, or MagES kinematics. Compare the feature with the perturbed-disc structures identified by Navarrete et al. to test whether an apparently stream-like signal belongs to the outer disc. Test whether the feature is more consistent with a warp, flare, or truncation, or with distinct tidal debris. As an extension, forward-model one or two existing interaction simulations.</w:t>
-      </w:r>
-    </w:p>
-    <w:p>
-      <w:pPr>
-        <w:spacing w:before="40" w:after="0" w:line="360" w:lineRule="auto"/>
-        <w:rPr>
-          <w:rFonts w:ascii="Arial" w:hAnsi="Arial" w:cs="Arial"/>
-          <w:sz w:val="22"/>
-          <w:szCs w:val="22"/>
-        </w:rPr>
-      </w:pPr>
-      <w:r>
-        <w:rPr>
-          <w:rFonts w:ascii="Arial" w:hAnsi="Arial" w:cs="Arial"/>
-          <w:sz w:val="22"/>
-          <w:szCs w:val="22"/>
-        </w:rPr>
-        <w:t>The core deliverables are a validated selection-function map, population-separated density maps, a smooth structural fit, and a quantitative case study of one feature. If the usable Euclid area is limited or a Consortium map precedes this work, the core analysis will narrow to the radial profile and population mixture of a known arm, the significance of a disc break, or a Euclid-versus-DELVE/SMASH completeness comparison. Possible extensions include red-clump distance mapping, diffuse-light comparisons, and expansion to the full usable LMC/SMC periphery.</w:t>
+        <w:t xml:space="preserve">Test and characterise candidate features. </w:t>
+      </w:r>
+      <w:r>
+        <w:rPr>
+          <w:rFonts w:ascii="Arial" w:hAnsi="Arial" w:cs="Arial"/>
+          <w:sz w:val="22"/>
+          <w:szCs w:val="22"/>
+        </w:rPr>
+        <w:t>Repeat the analysis with alternative colour-magnitude selections, masks, extinction corrections, and control regions. Describe robust structures by their location, extent, orientation, contrast, and turn-off sequence. Assess whether each is associated with the LMC, the SMC, or their interaction, without forcing an origin when the evidence does not decide.</w:t>
+      </w:r>
+    </w:p>
+    <w:p>
+      <w:pPr>
+        <w:spacing w:before="40" w:after="0" w:line="360" w:lineRule="auto"/>
+        <w:rPr>
+          <w:rFonts w:ascii="Arial" w:hAnsi="Arial" w:cs="Arial"/>
+          <w:sz w:val="22"/>
+          <w:szCs w:val="22"/>
+        </w:rPr>
+      </w:pPr>
+      <w:r>
+        <w:rPr>
+          <w:rFonts w:ascii="Arial" w:hAnsi="Arial" w:cs="Arial"/>
+          <w:sz w:val="22"/>
+          <w:szCs w:val="22"/>
+        </w:rPr>
+        <w:t>The main results will be measurements of the extent and structure of the smooth old stellar components around both Magellanic Clouds, together with a ranked atlas of credible substructure in Euclid DR1. Recovering the known periphery with a much larger turn-off sample will sharpen the present picture; finding a new arm, stream, or diffuse component would constrain the history of the LMC-SMC interaction.</w:t>
       </w:r>
     </w:p>
     <w:p>
@@ -471,7 +471,7 @@
           <w:sz w:val="22"/>
           <w:szCs w:val="22"/>
         </w:rPr>
-        <w:t>The student should be comfortable with Python, plotting, catalogue manipulation and basic statistics. Prior knowledge of colour–magnitude diagrams, coordinate transformations or Galactic dynamics would be useful but can be acquired during the project. Care in separating real low-density structure from survey systematics is more important than prior experience with sophisticated algorithms.</w:t>
+        <w:t>The student should be comfortable with scientific Python, basic statistics, and introductory stellar astronomy. Familiarity with colour-magnitude diagrams, catalogue queries, or spatial modelling would help but is not required. The necessary Euclid tools and methods for resolved stellar populations can be learned during the project; no previous Euclid experience is expected.</w:t>
       </w:r>
     </w:p>
     <w:p>
@@ -509,7 +509,7 @@
           <w:sz w:val="22"/>
           <w:szCs w:val="22"/>
         </w:rPr>
-        <w:t>Working with Euclid, Gaia, DELVE, SMASH and VMC catalogue products and survey masks.</w:t>
+        <w:t>Working with Euclid catalogues, sky footprints, masks, and photometric quality information.</w:t>
       </w:r>
     </w:p>
     <w:p>
@@ -533,7 +533,7 @@
           <w:sz w:val="22"/>
           <w:szCs w:val="22"/>
         </w:rPr>
-        <w:t>Stellar-population selection in colour–magnitude space and extinction correction.</w:t>
+        <w:t>Selecting old stellar populations in colour-magnitude space.</w:t>
       </w:r>
     </w:p>
     <w:p>
@@ -557,7 +557,7 @@
           <w:sz w:val="22"/>
           <w:szCs w:val="22"/>
         </w:rPr>
-        <w:t>Coordinate transformations, spatial density estimation and parametric structural modelling.</w:t>
+        <w:t>Constructing stellar-density maps and fitting simple spatial models.</w:t>
       </w:r>
     </w:p>
     <w:p>
@@ -581,7 +581,7 @@
           <w:sz w:val="22"/>
           <w:szCs w:val="22"/>
         </w:rPr>
-        <w:t>Mixture models, resampling tests and propagation of completeness and foreground uncertainty.</w:t>
+        <w:t>Testing low-density structures against foregrounds, completeness, extinction, and survey artefacts.</w:t>
       </w:r>
     </w:p>
     <w:p>
@@ -605,7 +605,7 @@
           <w:sz w:val="22"/>
           <w:szCs w:val="22"/>
         </w:rPr>
-        <w:t>Clear visual presentation of large sky maps and reproducible scientific workflows.</w:t>
+        <w:t>Reproducible analysis and clear visual presentation of large sky maps.</w:t>
       </w:r>
     </w:p>
     <w:p>
@@ -675,7 +675,7 @@
           <w:sz w:val="22"/>
           <w:szCs w:val="22"/>
         </w:rPr>
-        <w:t>Belokurov, V. et al. (2017), ‘Clouds, Streams and Bridges: Redrawing the blueprint of the Magellanic System with Gaia DR1’, MNRAS, 466, 4711. https://doi.org/10.1093/mnras/stw3357</w:t>
+        <w:t>Belokurov, V. &amp; Koposov, S. E. (2016), 'Stellar streams around the Magellanic Clouds', MNRAS, 456, 602. https://doi.org/10.1093/mnras/stv2688</w:t>
       </w:r>
     </w:p>
     <w:p>
@@ -699,7 +699,7 @@
           <w:sz w:val="22"/>
           <w:szCs w:val="22"/>
         </w:rPr>
-        <w:t>Mackey, D. et al. (2018), ‘Substructures and Tidal Distortions in the Magellanic Stellar Periphery’, ApJL, 858, L21. https://doi.org/10.3847/2041-8213/aac175</w:t>
+        <w:t>Mackey, A. D. et al. (2016), 'A 10 kpc stellar substructure at the edge of the Large Magellanic Cloud: perturbed outer disc or evidence for tidal stripping?', MNRAS, 459, 239. https://doi.org/10.1093/mnras/stw497</w:t>
       </w:r>
     </w:p>
     <w:p>
@@ -723,7 +723,7 @@
           <w:sz w:val="22"/>
           <w:szCs w:val="22"/>
         </w:rPr>
-        <w:t>Navarrete, C. et al. (2019), ‘Stellar streams around the Magellanic Clouds in 4D’, MNRAS, 483, 4160. https://doi.org/10.1093/mnras/sty3347</w:t>
+        <w:t>Belokurov, V. et al. (2017), 'Clouds, Streams and Bridges: redrawing the blueprint of the Magellanic System with Gaia DR1', MNRAS, 466, 4711. https://doi.org/10.1093/mnras/stw3357</w:t>
       </w:r>
     </w:p>
     <w:p>
@@ -747,7 +747,7 @@
           <w:sz w:val="22"/>
           <w:szCs w:val="22"/>
         </w:rPr>
-        <w:t>Navarrete, C. et al. (2023), ‘The 3D kinematics of stellar substructures in the periphery of the Large Magellanic Cloud’, MNRAS, 523, 4720. https://doi.org/10.1093/mnras/stad1698</w:t>
+        <w:t>Mackey, D. et al. (2018), 'Substructures and tidal distortions in the Magellanic stellar periphery', ApJL, 858, L21. https://doi.org/10.3847/2041-8213/aac175</w:t>
       </w:r>
     </w:p>
     <w:p>
@@ -771,7 +771,7 @@
           <w:sz w:val="22"/>
           <w:szCs w:val="22"/>
         </w:rPr>
-        <w:t>Cullinane, L. R. et al. (2022), ‘The Magellanic Edges Survey III: Kinematics of the disturbed LMC outskirts’, MNRAS, 512, 4798. https://doi.org/10.1093/mnras/stac733</w:t>
+        <w:t>Navarrete, C. et al. (2019), 'Stellar streams around the Magellanic Clouds in 4D', MNRAS, 483, 4160. https://doi.org/10.1093/mnras/sty3347</w:t>
       </w:r>
     </w:p>
     <w:p>
@@ -795,7 +795,7 @@
           <w:sz w:val="22"/>
           <w:szCs w:val="22"/>
         </w:rPr>
-        <w:t>Cullinane, L. R. et al. (2023), ‘The Magellanic Edges Survey IV: Complex tidal debris in the SMC outskirts’, MNRAS Letters, 518, L25. https://doi.org/10.1093/mnrasl/slac129</w:t>
+        <w:t>Massana, P. et al. (2020), 'SMASHing the low surface brightness SMC', MNRAS, 498, 1034. https://doi.org/10.1093/mnras/staa2451</w:t>
       </w:r>
     </w:p>
     <w:p>
@@ -819,7 +819,7 @@
           <w:sz w:val="22"/>
           <w:szCs w:val="22"/>
         </w:rPr>
-        <w:t>Drlica-Wagner, A. et al. (2021), ‘The DECam Local Volume Exploration Survey: Overview and First Data Release’, ApJS, 256, 2. https://doi.org/10.3847/1538-4365/ac079d</w:t>
+        <w:t>Drlica-Wagner, A. et al. (2021), 'The DECam Local Volume Exploration Survey: Overview and First Data Release', ApJS, 256, 2. https://doi.org/10.3847/1538-4365/ac079d</w:t>
       </w:r>
     </w:p>
     <w:p>
@@ -843,7 +843,7 @@
           <w:sz w:val="22"/>
           <w:szCs w:val="22"/>
         </w:rPr>
-        <w:t>Oden, S. J. et al. (2026), ‘Warped and Hooked: Mapping the Magellanic Clouds in Three Dimensions Using Red Clump Stars’, ApJ, 1003, 9. https://doi.org/10.3847/1538-4357/ae5c9e</w:t>
+        <w:t>Navarrete, C. et al. (2023), 'The 3D kinematics of stellar substructures in the periphery of the Large Magellanic Cloud', MNRAS, 523, 4720. https://doi.org/10.1093/mnras/stad1698</w:t>
       </w:r>
     </w:p>
     <w:p>
@@ -881,7 +881,7 @@
           <w:sz w:val="22"/>
           <w:szCs w:val="22"/>
         </w:rPr>
-        <w:t>Euclid Consortium, ‘DR1 Key Projects’. https://www.euclid-ec.org/about/contact/dr1-key-project-leads/</w:t>
+        <w:t>Euclid NASA Science Center at IPAC, 'Euclid DR1 release dates, footprint, and data content'. https://euclid.caltech.edu/page/euclid-dr1</w:t>
       </w:r>
     </w:p>
     <w:p>
@@ -905,7 +905,7 @@
           <w:sz w:val="22"/>
           <w:szCs w:val="22"/>
         </w:rPr>
-        <w:t>Scaramella, R. et al. (2022), ‘Euclid preparation. I. The Euclid Wide Survey’, A&amp;A, 662, A112. https://doi.org/10.1051/0004-6361/202141938</w:t>
+        <w:t>Scaramella, R. et al. (2022), 'Euclid preparation. I. The Euclid Wide Survey', A&amp;A, 662, A112. https://doi.org/10.1051/0004-6361/202141938</w:t>
       </w:r>
     </w:p>
     <w:sectPr>

</xml_diff>